<commit_message>
Updated till detailed analysis
</commit_message>
<xml_diff>
--- a/inflation_analysis.docx
+++ b/inflation_analysis.docx
@@ -232,13 +232,21 @@
     </w:tbl>
     <w:bookmarkEnd w:id="29"/>
     <w:bookmarkEnd w:id="30"/>
-    <w:bookmarkStart w:id="42" w:name="top-5-changes"/>
+    <w:bookmarkStart w:id="43" w:name="category-wise-inflation-breakdown"/>
     <w:p>
       <w:pPr>
         <w:pStyle w:val="Heading1"/>
       </w:pPr>
       <w:r>
-        <w:t xml:space="preserve">2. Top 5 Changes</w:t>
+        <w:t xml:space="preserve">2. Category-wise Inflation Breakdown</w:t>
+      </w:r>
+    </w:p>
+    <w:p>
+      <w:pPr>
+        <w:pStyle w:val="FirstParagraph"/>
+      </w:pPr>
+      <w:r>
+        <w:t xml:space="preserve">This section shows how different CPI categories contribute to overall inflation, providing insights into which sectors are driving price changes.</w:t>
       </w:r>
     </w:p>
     <w:tbl>
@@ -254,7 +262,7 @@
       <w:tr>
         <w:tc>
           <w:tcPr/>
-          <w:bookmarkStart w:id="34" w:name="fig-top-changes"/>
+          <w:bookmarkStart w:id="34" w:name="fig-category-breakdown"/>
           <w:p>
             <w:pPr>
               <w:pStyle w:val="Compact"/>
@@ -263,20 +271,620 @@
             <w:r>
               <w:drawing>
                 <wp:inline>
-                  <wp:extent cx="5334000" cy="4255970"/>
+                  <wp:extent cx="5334000" cy="3030863"/>
                   <wp:effectExtent b="0" l="0" r="0" t="0"/>
                   <wp:docPr descr="" title="" id="32" name="Picture"/>
                   <a:graphic>
                     <a:graphicData uri="http://schemas.openxmlformats.org/drawingml/2006/picture">
                       <pic:pic>
                         <pic:nvPicPr>
-                          <pic:cNvPr descr="inflation_analysis_files/figure-docx/fig-top-changes-output-1.png" id="33" name="Picture"/>
+                          <pic:cNvPr descr="inflation_analysis_files/figure-docx/fig-category-breakdown-output-1.png" id="33" name="Picture"/>
                           <pic:cNvPicPr>
                             <a:picLocks noChangeArrowheads="1" noChangeAspect="1"/>
                           </pic:cNvPicPr>
                         </pic:nvPicPr>
                         <pic:blipFill>
                           <a:blip r:embed="rId31"/>
+                          <a:stretch>
+                            <a:fillRect/>
+                          </a:stretch>
+                        </pic:blipFill>
+                        <pic:spPr bwMode="auto">
+                          <a:xfrm>
+                            <a:off x="0" y="0"/>
+                            <a:ext cx="5334000" cy="3030863"/>
+                          </a:xfrm>
+                          <a:prstGeom prst="rect">
+                            <a:avLst/>
+                          </a:prstGeom>
+                          <a:noFill/>
+                          <a:ln w="9525">
+                            <a:noFill/>
+                            <a:headEnd/>
+                            <a:tailEnd/>
+                          </a:ln>
+                        </pic:spPr>
+                      </pic:pic>
+                    </a:graphicData>
+                  </a:graphic>
+                </wp:inline>
+              </w:drawing>
+            </w:r>
+          </w:p>
+          <w:p>
+            <w:pPr>
+              <w:jc w:val="center"/>
+            </w:pPr>
+            <w:pPr>
+              <w:jc w:val="left"/>
+              <w:spacing w:before="200"/>
+              <w:pStyle w:val="ImageCaption"/>
+            </w:pPr>
+            <w:r>
+              <w:t xml:space="preserve">Figure 3: CPI Category Breakdown: Overall Inflation Line with Category Components</w:t>
+            </w:r>
+          </w:p>
+          <w:bookmarkEnd w:id="34"/>
+        </w:tc>
+      </w:tr>
+    </w:tbl>
+    <w:bookmarkStart w:id="39" w:name="category-contributions-analysis"/>
+    <w:p>
+      <w:pPr>
+        <w:pStyle w:val="Heading2"/>
+      </w:pPr>
+      <w:r>
+        <w:t xml:space="preserve">2.1 Category Contributions Analysis</w:t>
+      </w:r>
+    </w:p>
+    <w:tbl>
+      <w:tblPr>
+        <w:tblStyle w:val="Table"/>
+        <w:tblW w:type="pct" w:w="5000"/>
+        <w:tblLayout w:type="fixed"/>
+        <w:tblLook w:firstRow="0" w:lastRow="0" w:firstColumn="0" w:lastColumn="0" w:noHBand="0" w:noVBand="0" w:val="0000"/>
+      </w:tblPr>
+      <w:tblGrid>
+        <w:gridCol w:w="7920"/>
+      </w:tblGrid>
+      <w:tr>
+        <w:tc>
+          <w:tcPr/>
+          <w:bookmarkStart w:id="38" w:name="fig-category-stacked"/>
+          <w:p>
+            <w:pPr>
+              <w:pStyle w:val="Compact"/>
+              <w:jc w:val="center"/>
+            </w:pPr>
+            <w:r>
+              <w:drawing>
+                <wp:inline>
+                  <wp:extent cx="5334000" cy="3030863"/>
+                  <wp:effectExtent b="0" l="0" r="0" t="0"/>
+                  <wp:docPr descr="" title="" id="36" name="Picture"/>
+                  <a:graphic>
+                    <a:graphicData uri="http://schemas.openxmlformats.org/drawingml/2006/picture">
+                      <pic:pic>
+                        <pic:nvPicPr>
+                          <pic:cNvPr descr="inflation_analysis_files/figure-docx/fig-category-stacked-output-1.png" id="37" name="Picture"/>
+                          <pic:cNvPicPr>
+                            <a:picLocks noChangeArrowheads="1" noChangeAspect="1"/>
+                          </pic:cNvPicPr>
+                        </pic:nvPicPr>
+                        <pic:blipFill>
+                          <a:blip r:embed="rId35"/>
+                          <a:stretch>
+                            <a:fillRect/>
+                          </a:stretch>
+                        </pic:blipFill>
+                        <pic:spPr bwMode="auto">
+                          <a:xfrm>
+                            <a:off x="0" y="0"/>
+                            <a:ext cx="5334000" cy="3030863"/>
+                          </a:xfrm>
+                          <a:prstGeom prst="rect">
+                            <a:avLst/>
+                          </a:prstGeom>
+                          <a:noFill/>
+                          <a:ln w="9525">
+                            <a:noFill/>
+                            <a:headEnd/>
+                            <a:tailEnd/>
+                          </a:ln>
+                        </pic:spPr>
+                      </pic:pic>
+                    </a:graphicData>
+                  </a:graphic>
+                </wp:inline>
+              </w:drawing>
+            </w:r>
+          </w:p>
+          <w:p>
+            <w:pPr>
+              <w:jc w:val="center"/>
+            </w:pPr>
+            <w:pPr>
+              <w:jc w:val="left"/>
+              <w:spacing w:before="200"/>
+              <w:pStyle w:val="ImageCaption"/>
+            </w:pPr>
+            <w:r>
+              <w:t xml:space="preserve">Figure 4: Category-wise Inflation Rates - Stacked View</w:t>
+            </w:r>
+          </w:p>
+          <w:bookmarkEnd w:id="38"/>
+        </w:tc>
+      </w:tr>
+    </w:tbl>
+    <w:bookmarkEnd w:id="39"/>
+    <w:bookmarkStart w:id="42" w:name="recent-category-trends"/>
+    <w:p>
+      <w:pPr>
+        <w:pStyle w:val="Heading2"/>
+      </w:pPr>
+      <w:r>
+        <w:t xml:space="preserve">2.2 Recent Category Trends</w:t>
+      </w:r>
+    </w:p>
+    <w:bookmarkStart w:id="40" w:name="current-month-october-2025"/>
+    <w:p>
+      <w:pPr>
+        <w:pStyle w:val="Heading3"/>
+      </w:pPr>
+      <w:r>
+        <w:t xml:space="preserve">2.2.1 Current Month: October 2025</w:t>
+      </w:r>
+    </w:p>
+    <w:tbl>
+      <w:tblPr>
+        <w:tblStyle w:val="Table"/>
+        <w:tblW w:type="auto" w:w="0"/>
+        <w:tblLook w:firstRow="1" w:lastRow="0" w:firstColumn="0" w:lastColumn="0" w:noHBand="0" w:noVBand="0" w:val="0020"/>
+      </w:tblPr>
+      <w:tblGrid>
+        <w:gridCol w:w="1980"/>
+        <w:gridCol w:w="1980"/>
+        <w:gridCol w:w="1980"/>
+        <w:gridCol w:w="1980"/>
+      </w:tblGrid>
+      <w:tr>
+        <w:trPr>
+          <w:tblHeader w:val="on"/>
+        </w:trPr>
+        <w:tc>
+          <w:tcPr/>
+          <w:p>
+            <w:pPr>
+              <w:pStyle w:val="Compact"/>
+            </w:pPr>
+            <w:r>
+              <w:t xml:space="preserve">Category</w:t>
+            </w:r>
+          </w:p>
+        </w:tc>
+        <w:tc>
+          <w:tcPr/>
+          <w:p>
+            <w:pPr>
+              <w:pStyle w:val="Compact"/>
+            </w:pPr>
+            <w:r>
+              <w:t xml:space="preserve">Current YoY (%)</w:t>
+            </w:r>
+          </w:p>
+        </w:tc>
+        <w:tc>
+          <w:tcPr/>
+          <w:p>
+            <w:pPr>
+              <w:pStyle w:val="Compact"/>
+            </w:pPr>
+            <w:r>
+              <w:t xml:space="preserve">Previous Month (%)</w:t>
+            </w:r>
+          </w:p>
+        </w:tc>
+        <w:tc>
+          <w:tcPr/>
+          <w:p>
+            <w:pPr>
+              <w:pStyle w:val="Compact"/>
+            </w:pPr>
+            <w:r>
+              <w:t xml:space="preserve">Change</w:t>
+            </w:r>
+          </w:p>
+        </w:tc>
+      </w:tr>
+      <w:tr>
+        <w:tc>
+          <w:tcPr/>
+          <w:p>
+            <w:pPr>
+              <w:pStyle w:val="Compact"/>
+            </w:pPr>
+            <w:r>
+              <w:t xml:space="preserve">Food &amp; Beverages</w:t>
+            </w:r>
+          </w:p>
+        </w:tc>
+        <w:tc>
+          <w:tcPr/>
+          <w:p>
+            <w:pPr>
+              <w:pStyle w:val="Compact"/>
+            </w:pPr>
+            <w:r>
+              <w:t xml:space="preserve">-3.72%</w:t>
+            </w:r>
+          </w:p>
+        </w:tc>
+        <w:tc>
+          <w:tcPr/>
+          <w:p>
+            <w:pPr>
+              <w:pStyle w:val="Compact"/>
+            </w:pPr>
+            <w:r>
+              <w:t xml:space="preserve">-1.37%</w:t>
+            </w:r>
+          </w:p>
+        </w:tc>
+        <w:tc>
+          <w:tcPr/>
+          <w:p>
+            <w:pPr>
+              <w:pStyle w:val="Compact"/>
+            </w:pPr>
+            <w:r>
+              <w:t xml:space="preserve">↓ 2.36pp</w:t>
+            </w:r>
+          </w:p>
+        </w:tc>
+      </w:tr>
+      <w:tr>
+        <w:tc>
+          <w:tcPr/>
+          <w:p>
+            <w:pPr>
+              <w:pStyle w:val="Compact"/>
+            </w:pPr>
+            <w:r>
+              <w:t xml:space="preserve">Pan, Tobacco &amp; Intox</w:t>
+            </w:r>
+          </w:p>
+        </w:tc>
+        <w:tc>
+          <w:tcPr/>
+          <w:p>
+            <w:pPr>
+              <w:pStyle w:val="Compact"/>
+            </w:pPr>
+            <w:r>
+              <w:t xml:space="preserve">2.87%</w:t>
+            </w:r>
+          </w:p>
+        </w:tc>
+        <w:tc>
+          <w:tcPr/>
+          <w:p>
+            <w:pPr>
+              <w:pStyle w:val="Compact"/>
+            </w:pPr>
+            <w:r>
+              <w:t xml:space="preserve">2.73%</w:t>
+            </w:r>
+          </w:p>
+        </w:tc>
+        <w:tc>
+          <w:tcPr/>
+          <w:p>
+            <w:pPr>
+              <w:pStyle w:val="Compact"/>
+            </w:pPr>
+            <w:r>
+              <w:t xml:space="preserve">↑ 0.14pp</w:t>
+            </w:r>
+          </w:p>
+        </w:tc>
+      </w:tr>
+      <w:tr>
+        <w:tc>
+          <w:tcPr/>
+          <w:p>
+            <w:pPr>
+              <w:pStyle w:val="Compact"/>
+            </w:pPr>
+            <w:r>
+              <w:t xml:space="preserve">Clothing &amp; Footwear</w:t>
+            </w:r>
+          </w:p>
+        </w:tc>
+        <w:tc>
+          <w:tcPr/>
+          <w:p>
+            <w:pPr>
+              <w:pStyle w:val="Compact"/>
+            </w:pPr>
+            <w:r>
+              <w:t xml:space="preserve">1.70%</w:t>
+            </w:r>
+          </w:p>
+        </w:tc>
+        <w:tc>
+          <w:tcPr/>
+          <w:p>
+            <w:pPr>
+              <w:pStyle w:val="Compact"/>
+            </w:pPr>
+            <w:r>
+              <w:t xml:space="preserve">2.28%</w:t>
+            </w:r>
+          </w:p>
+        </w:tc>
+        <w:tc>
+          <w:tcPr/>
+          <w:p>
+            <w:pPr>
+              <w:pStyle w:val="Compact"/>
+            </w:pPr>
+            <w:r>
+              <w:t xml:space="preserve">↓ 0.58pp</w:t>
+            </w:r>
+          </w:p>
+        </w:tc>
+      </w:tr>
+      <w:tr>
+        <w:tc>
+          <w:tcPr/>
+          <w:p>
+            <w:pPr>
+              <w:pStyle w:val="Compact"/>
+            </w:pPr>
+            <w:r>
+              <w:t xml:space="preserve">Housing</w:t>
+            </w:r>
+          </w:p>
+        </w:tc>
+        <w:tc>
+          <w:tcPr/>
+          <w:p>
+            <w:pPr>
+              <w:pStyle w:val="Compact"/>
+            </w:pPr>
+            <w:r>
+              <w:t xml:space="preserve">2.96%</w:t>
+            </w:r>
+          </w:p>
+        </w:tc>
+        <w:tc>
+          <w:tcPr/>
+          <w:p>
+            <w:pPr>
+              <w:pStyle w:val="Compact"/>
+            </w:pPr>
+            <w:r>
+              <w:t xml:space="preserve">2.98%</w:t>
+            </w:r>
+          </w:p>
+        </w:tc>
+        <w:tc>
+          <w:tcPr/>
+          <w:p>
+            <w:pPr>
+              <w:pStyle w:val="Compact"/>
+            </w:pPr>
+            <w:r>
+              <w:t xml:space="preserve">↓ 0.03pp</w:t>
+            </w:r>
+          </w:p>
+        </w:tc>
+      </w:tr>
+      <w:tr>
+        <w:tc>
+          <w:tcPr/>
+          <w:p>
+            <w:pPr>
+              <w:pStyle w:val="Compact"/>
+            </w:pPr>
+            <w:r>
+              <w:t xml:space="preserve">Fuel &amp; Light</w:t>
+            </w:r>
+          </w:p>
+        </w:tc>
+        <w:tc>
+          <w:tcPr/>
+          <w:p>
+            <w:pPr>
+              <w:pStyle w:val="Compact"/>
+            </w:pPr>
+            <w:r>
+              <w:t xml:space="preserve">1.98%</w:t>
+            </w:r>
+          </w:p>
+        </w:tc>
+        <w:tc>
+          <w:tcPr/>
+          <w:p>
+            <w:pPr>
+              <w:pStyle w:val="Compact"/>
+            </w:pPr>
+            <w:r>
+              <w:t xml:space="preserve">1.98%</w:t>
+            </w:r>
+          </w:p>
+        </w:tc>
+        <w:tc>
+          <w:tcPr/>
+          <w:p>
+            <w:pPr>
+              <w:pStyle w:val="Compact"/>
+            </w:pPr>
+            <w:r>
+              <w:t xml:space="preserve">↑ 0.00pp</w:t>
+            </w:r>
+          </w:p>
+        </w:tc>
+      </w:tr>
+      <w:tr>
+        <w:tc>
+          <w:tcPr/>
+          <w:p>
+            <w:pPr>
+              <w:pStyle w:val="Compact"/>
+            </w:pPr>
+            <w:r>
+              <w:t xml:space="preserve">Miscellaneous</w:t>
+            </w:r>
+          </w:p>
+        </w:tc>
+        <w:tc>
+          <w:tcPr/>
+          <w:p>
+            <w:pPr>
+              <w:pStyle w:val="Compact"/>
+            </w:pPr>
+            <w:r>
+              <w:t xml:space="preserve">5.71%</w:t>
+            </w:r>
+          </w:p>
+        </w:tc>
+        <w:tc>
+          <w:tcPr/>
+          <w:p>
+            <w:pPr>
+              <w:pStyle w:val="Compact"/>
+            </w:pPr>
+            <w:r>
+              <w:t xml:space="preserve">5.35%</w:t>
+            </w:r>
+          </w:p>
+        </w:tc>
+        <w:tc>
+          <w:tcPr/>
+          <w:p>
+            <w:pPr>
+              <w:pStyle w:val="Compact"/>
+            </w:pPr>
+            <w:r>
+              <w:t xml:space="preserve">↑ 0.35pp</w:t>
+            </w:r>
+          </w:p>
+        </w:tc>
+      </w:tr>
+    </w:tbl>
+    <w:bookmarkEnd w:id="40"/>
+    <w:bookmarkStart w:id="41" w:name="key-insights"/>
+    <w:p>
+      <w:pPr>
+        <w:pStyle w:val="Heading3"/>
+      </w:pPr>
+      <w:r>
+        <w:t xml:space="preserve">2.2.2 Key Insights</w:t>
+      </w:r>
+    </w:p>
+    <w:p>
+      <w:pPr>
+        <w:numPr>
+          <w:ilvl w:val="0"/>
+          <w:numId w:val="1001"/>
+        </w:numPr>
+      </w:pPr>
+      <w:r>
+        <w:rPr>
+          <w:b/>
+          <w:bCs/>
+        </w:rPr>
+        <w:t xml:space="preserve">Highest inflation</w:t>
+      </w:r>
+      <w:r>
+        <w:t xml:space="preserve">: Miscellaneous at 5.71% YoY</w:t>
+      </w:r>
+    </w:p>
+    <w:p>
+      <w:pPr>
+        <w:numPr>
+          <w:ilvl w:val="0"/>
+          <w:numId w:val="1001"/>
+        </w:numPr>
+      </w:pPr>
+      <w:r>
+        <w:rPr>
+          <w:b/>
+          <w:bCs/>
+        </w:rPr>
+        <w:t xml:space="preserve">Lowest inflation</w:t>
+      </w:r>
+      <w:r>
+        <w:t xml:space="preserve">: Food &amp; Beverages at -3.72% YoY</w:t>
+      </w:r>
+    </w:p>
+    <w:p>
+      <w:pPr>
+        <w:numPr>
+          <w:ilvl w:val="0"/>
+          <w:numId w:val="1001"/>
+        </w:numPr>
+      </w:pPr>
+      <w:r>
+        <w:rPr>
+          <w:b/>
+          <w:bCs/>
+        </w:rPr>
+        <w:t xml:space="preserve">Categories in deflation</w:t>
+      </w:r>
+      <w:r>
+        <w:t xml:space="preserve">: Food &amp; Beverages</w:t>
+      </w:r>
+    </w:p>
+    <w:bookmarkEnd w:id="41"/>
+    <w:bookmarkEnd w:id="42"/>
+    <w:bookmarkEnd w:id="43"/>
+    <w:bookmarkStart w:id="55" w:name="top-5-changes"/>
+    <w:p>
+      <w:pPr>
+        <w:pStyle w:val="Heading1"/>
+      </w:pPr>
+      <w:r>
+        <w:t xml:space="preserve">3. Top 5 Changes</w:t>
+      </w:r>
+    </w:p>
+    <w:tbl>
+      <w:tblPr>
+        <w:tblStyle w:val="Table"/>
+        <w:tblW w:type="pct" w:w="5000"/>
+        <w:tblLayout w:type="fixed"/>
+        <w:tblLook w:firstRow="0" w:lastRow="0" w:firstColumn="0" w:lastColumn="0" w:noHBand="0" w:noVBand="0" w:val="0000"/>
+      </w:tblPr>
+      <w:tblGrid>
+        <w:gridCol w:w="7920"/>
+      </w:tblGrid>
+      <w:tr>
+        <w:tc>
+          <w:tcPr/>
+          <w:bookmarkStart w:id="47" w:name="fig-top-changes"/>
+          <w:p>
+            <w:pPr>
+              <w:pStyle w:val="Compact"/>
+              <w:jc w:val="center"/>
+            </w:pPr>
+            <w:r>
+              <w:drawing>
+                <wp:inline>
+                  <wp:extent cx="5334000" cy="4255970"/>
+                  <wp:effectExtent b="0" l="0" r="0" t="0"/>
+                  <wp:docPr descr="" title="" id="45" name="Picture"/>
+                  <a:graphic>
+                    <a:graphicData uri="http://schemas.openxmlformats.org/drawingml/2006/picture">
+                      <pic:pic>
+                        <pic:nvPicPr>
+                          <pic:cNvPr descr="inflation_analysis_files/figure-docx/fig-top-changes-output-1.png" id="46" name="Picture"/>
+                          <pic:cNvPicPr>
+                            <a:picLocks noChangeArrowheads="1" noChangeAspect="1"/>
+                          </pic:cNvPicPr>
+                        </pic:nvPicPr>
+                        <pic:blipFill>
+                          <a:blip r:embed="rId44"/>
                           <a:stretch>
                             <a:fillRect/>
                           </a:stretch>
@@ -313,27 +921,27 @@
               <w:pStyle w:val="ImageCaption"/>
             </w:pPr>
             <w:r>
-              <w:t xml:space="preserve">Figure 3: Top Inflationary and Deflationary Categories (Month-on-Month)</w:t>
-            </w:r>
-          </w:p>
-          <w:bookmarkEnd w:id="34"/>
+              <w:t xml:space="preserve">Figure 5: Top Inflationary and Deflationary Categories (Month-on-Month)</w:t>
+            </w:r>
+          </w:p>
+          <w:bookmarkEnd w:id="47"/>
         </w:tc>
       </w:tr>
     </w:tbl>
-    <w:bookmarkStart w:id="35" w:name="key-observations"/>
+    <w:bookmarkStart w:id="48" w:name="key-observations"/>
     <w:p>
       <w:pPr>
         <w:pStyle w:val="Heading2"/>
       </w:pPr>
       <w:r>
-        <w:t xml:space="preserve">2.1 Key Observations</w:t>
+        <w:t xml:space="preserve">3.1 Key Observations</w:t>
       </w:r>
     </w:p>
     <w:p>
       <w:pPr>
         <w:numPr>
           <w:ilvl w:val="0"/>
-          <w:numId w:val="1001"/>
+          <w:numId w:val="1002"/>
         </w:numPr>
       </w:pPr>
       <w:r>
@@ -341,7 +949,7 @@
           <w:b/>
           <w:bCs/>
         </w:rPr>
-        <w:t xml:space="preserve">Silver</w:t>
+        <w:t xml:space="preserve">Food &amp; Beverages_YoY</w:t>
       </w:r>
       <w:r>
         <w:t xml:space="preserve"> </w:t>
@@ -357,7 +965,7 @@
           <w:b/>
           <w:bCs/>
         </w:rPr>
-        <w:t xml:space="preserve">21.68%</w:t>
+        <w:t xml:space="preserve">172.45%</w:t>
       </w:r>
       <w:r>
         <w:t xml:space="preserve"> </w:t>
@@ -370,7 +978,7 @@
       <w:pPr>
         <w:numPr>
           <w:ilvl w:val="0"/>
-          <w:numId w:val="1001"/>
+          <w:numId w:val="1002"/>
         </w:numPr>
       </w:pPr>
       <w:r>
@@ -378,7 +986,7 @@
           <w:b/>
           <w:bCs/>
         </w:rPr>
-        <w:t xml:space="preserve">Motor Car, Jeep</w:t>
+        <w:t xml:space="preserve">Radish</w:t>
       </w:r>
       <w:r>
         <w:t xml:space="preserve"> </w:t>
@@ -394,7 +1002,7 @@
           <w:b/>
           <w:bCs/>
         </w:rPr>
-        <w:t xml:space="preserve">-6.85%</w:t>
+        <w:t xml:space="preserve">-9.41%</w:t>
       </w:r>
       <w:r>
         <w:t xml:space="preserve"> </w:t>
@@ -403,14 +1011,14 @@
         <w:t xml:space="preserve">decrease.</w:t>
       </w:r>
     </w:p>
-    <w:bookmarkEnd w:id="35"/>
-    <w:bookmarkStart w:id="41" w:name="year-on-year-top-movers"/>
+    <w:bookmarkEnd w:id="48"/>
+    <w:bookmarkStart w:id="54" w:name="year-on-year-top-movers"/>
     <w:p>
       <w:pPr>
         <w:pStyle w:val="Heading2"/>
       </w:pPr>
       <w:r>
-        <w:t xml:space="preserve">2.2 Year-on-Year Top Movers</w:t>
+        <w:t xml:space="preserve">3.2 Year-on-Year Top Movers</w:t>
       </w:r>
     </w:p>
     <w:tbl>
@@ -426,7 +1034,7 @@
       <w:tr>
         <w:tc>
           <w:tcPr/>
-          <w:bookmarkStart w:id="39" w:name="fig-top-changes-yoy"/>
+          <w:bookmarkStart w:id="52" w:name="fig-top-changes-yoy"/>
           <w:p>
             <w:pPr>
               <w:pStyle w:val="Compact"/>
@@ -437,18 +1045,18 @@
                 <wp:inline>
                   <wp:extent cx="5334000" cy="4255970"/>
                   <wp:effectExtent b="0" l="0" r="0" t="0"/>
-                  <wp:docPr descr="" title="" id="37" name="Picture"/>
+                  <wp:docPr descr="" title="" id="50" name="Picture"/>
                   <a:graphic>
                     <a:graphicData uri="http://schemas.openxmlformats.org/drawingml/2006/picture">
                       <pic:pic>
                         <pic:nvPicPr>
-                          <pic:cNvPr descr="inflation_analysis_files/figure-docx/fig-top-changes-yoy-output-1.png" id="38" name="Picture"/>
+                          <pic:cNvPr descr="inflation_analysis_files/figure-docx/fig-top-changes-yoy-output-1.png" id="51" name="Picture"/>
                           <pic:cNvPicPr>
                             <a:picLocks noChangeArrowheads="1" noChangeAspect="1"/>
                           </pic:cNvPicPr>
                         </pic:nvPicPr>
                         <pic:blipFill>
-                          <a:blip r:embed="rId36"/>
+                          <a:blip r:embed="rId49"/>
                           <a:stretch>
                             <a:fillRect/>
                           </a:stretch>
@@ -485,27 +1093,27 @@
               <w:pStyle w:val="ImageCaption"/>
             </w:pPr>
             <w:r>
-              <w:t xml:space="preserve">Figure 4: Top Inflationary and Deflationary Categories (Year-on-Year)</w:t>
-            </w:r>
-          </w:p>
-          <w:bookmarkEnd w:id="39"/>
+              <w:t xml:space="preserve">Figure 6: Top Inflationary and Deflationary Categories (Year-on-Year)</w:t>
+            </w:r>
+          </w:p>
+          <w:bookmarkEnd w:id="52"/>
         </w:tc>
       </w:tr>
     </w:tbl>
-    <w:bookmarkStart w:id="40" w:name="key-observations-yoy"/>
+    <w:bookmarkStart w:id="53" w:name="key-observations-yoy"/>
     <w:p>
       <w:pPr>
         <w:pStyle w:val="Heading3"/>
       </w:pPr>
       <w:r>
-        <w:t xml:space="preserve">2.2.1 Key Observations (YoY)</w:t>
+        <w:t xml:space="preserve">3.2.1 Key Observations (YoY)</w:t>
       </w:r>
     </w:p>
     <w:p>
       <w:pPr>
         <w:numPr>
           <w:ilvl w:val="0"/>
-          <w:numId w:val="1002"/>
+          <w:numId w:val="1003"/>
         </w:numPr>
       </w:pPr>
       <w:r>
@@ -542,7 +1150,7 @@
       <w:pPr>
         <w:numPr>
           <w:ilvl w:val="0"/>
-          <w:numId w:val="1002"/>
+          <w:numId w:val="1003"/>
         </w:numPr>
       </w:pPr>
       <w:r>
@@ -550,7 +1158,7 @@
           <w:b/>
           <w:bCs/>
         </w:rPr>
-        <w:t xml:space="preserve">Ginger</w:t>
+        <w:t xml:space="preserve">Tomato</w:t>
       </w:r>
       <w:r>
         <w:t xml:space="preserve"> </w:t>
@@ -566,7 +1174,7 @@
           <w:b/>
           <w:bCs/>
         </w:rPr>
-        <w:t xml:space="preserve">-33.19%</w:t>
+        <w:t xml:space="preserve">-42.93%</w:t>
       </w:r>
       <w:r>
         <w:t xml:space="preserve"> </w:t>
@@ -575,16 +1183,16 @@
         <w:t xml:space="preserve">decrease.</w:t>
       </w:r>
     </w:p>
-    <w:bookmarkEnd w:id="40"/>
-    <w:bookmarkEnd w:id="41"/>
-    <w:bookmarkEnd w:id="42"/>
-    <w:bookmarkStart w:id="83" w:name="inflation-dispersion-analysis"/>
+    <w:bookmarkEnd w:id="53"/>
+    <w:bookmarkEnd w:id="54"/>
+    <w:bookmarkEnd w:id="55"/>
+    <w:bookmarkStart w:id="96" w:name="inflation-dispersion-analysis"/>
     <w:p>
       <w:pPr>
         <w:pStyle w:val="Heading1"/>
       </w:pPr>
       <w:r>
-        <w:t xml:space="preserve">3. Inflation Dispersion Analysis</w:t>
+        <w:t xml:space="preserve">4. Inflation Dispersion Analysis</w:t>
       </w:r>
     </w:p>
     <w:p>
@@ -595,13 +1203,13 @@
         <w:t xml:space="preserve">This section analyzes how inflation is distributed across different CPI components, showing whether price changes are broad-based or concentrated in specific items.</w:t>
       </w:r>
     </w:p>
-    <w:bookmarkStart w:id="47" w:name="distribution-over-time-normalized"/>
+    <w:bookmarkStart w:id="60" w:name="distribution-over-time-normalized"/>
     <w:p>
       <w:pPr>
         <w:pStyle w:val="Heading2"/>
       </w:pPr>
       <w:r>
-        <w:t xml:space="preserve">3.1 Distribution Over Time (Normalized)</w:t>
+        <w:t xml:space="preserve">4.1 Distribution Over Time (Normalized)</w:t>
       </w:r>
     </w:p>
     <w:tbl>
@@ -617,7 +1225,7 @@
       <w:tr>
         <w:tc>
           <w:tcPr/>
-          <w:bookmarkStart w:id="46" w:name="fig-dispersion-normalized"/>
+          <w:bookmarkStart w:id="59" w:name="fig-dispersion-normalized"/>
           <w:p>
             <w:pPr>
               <w:pStyle w:val="Compact"/>
@@ -628,18 +1236,18 @@
                 <wp:inline>
                   <wp:extent cx="5334000" cy="3035414"/>
                   <wp:effectExtent b="0" l="0" r="0" t="0"/>
-                  <wp:docPr descr="" title="" id="44" name="Picture"/>
+                  <wp:docPr descr="" title="" id="57" name="Picture"/>
                   <a:graphic>
                     <a:graphicData uri="http://schemas.openxmlformats.org/drawingml/2006/picture">
                       <pic:pic>
                         <pic:nvPicPr>
-                          <pic:cNvPr descr="inflation_analysis_files/figure-docx/fig-dispersion-normalized-output-1.png" id="45" name="Picture"/>
+                          <pic:cNvPr descr="inflation_analysis_files/figure-docx/fig-dispersion-normalized-output-1.png" id="58" name="Picture"/>
                           <pic:cNvPicPr>
                             <a:picLocks noChangeArrowheads="1" noChangeAspect="1"/>
                           </pic:cNvPicPr>
                         </pic:nvPicPr>
                         <pic:blipFill>
-                          <a:blip r:embed="rId43"/>
+                          <a:blip r:embed="rId56"/>
                           <a:stretch>
                             <a:fillRect/>
                           </a:stretch>
@@ -676,21 +1284,21 @@
               <w:pStyle w:val="ImageCaption"/>
             </w:pPr>
             <w:r>
-              <w:t xml:space="preserve">Figure 5: Inflation Dispersion - Percentage of CPI Components by Bracket</w:t>
-            </w:r>
-          </w:p>
-          <w:bookmarkEnd w:id="46"/>
+              <w:t xml:space="preserve">Figure 7: Inflation Dispersion - Percentage of CPI Components by Bracket</w:t>
+            </w:r>
+          </w:p>
+          <w:bookmarkEnd w:id="59"/>
         </w:tc>
       </w:tr>
     </w:tbl>
-    <w:bookmarkEnd w:id="47"/>
-    <w:bookmarkStart w:id="52" w:name="recent-trends-last-3-years"/>
+    <w:bookmarkEnd w:id="60"/>
+    <w:bookmarkStart w:id="65" w:name="recent-trends-last-3-years"/>
     <w:p>
       <w:pPr>
         <w:pStyle w:val="Heading2"/>
       </w:pPr>
       <w:r>
-        <w:t xml:space="preserve">3.2 Recent Trends (Last 3 Years)</w:t>
+        <w:t xml:space="preserve">4.2 Recent Trends (Last 3 Years)</w:t>
       </w:r>
     </w:p>
     <w:tbl>
@@ -706,7 +1314,7 @@
       <w:tr>
         <w:tc>
           <w:tcPr/>
-          <w:bookmarkStart w:id="51" w:name="fig-dispersion-normalized-3yr"/>
+          <w:bookmarkStart w:id="64" w:name="fig-dispersion-normalized-3yr"/>
           <w:p>
             <w:pPr>
               <w:pStyle w:val="Compact"/>
@@ -717,18 +1325,18 @@
                 <wp:inline>
                   <wp:extent cx="5334000" cy="3030863"/>
                   <wp:effectExtent b="0" l="0" r="0" t="0"/>
-                  <wp:docPr descr="" title="" id="49" name="Picture"/>
+                  <wp:docPr descr="" title="" id="62" name="Picture"/>
                   <a:graphic>
                     <a:graphicData uri="http://schemas.openxmlformats.org/drawingml/2006/picture">
                       <pic:pic>
                         <pic:nvPicPr>
-                          <pic:cNvPr descr="inflation_analysis_files/figure-docx/fig-dispersion-normalized-3yr-output-1.png" id="50" name="Picture"/>
+                          <pic:cNvPr descr="inflation_analysis_files/figure-docx/fig-dispersion-normalized-3yr-output-1.png" id="63" name="Picture"/>
                           <pic:cNvPicPr>
                             <a:picLocks noChangeArrowheads="1" noChangeAspect="1"/>
                           </pic:cNvPicPr>
                         </pic:nvPicPr>
                         <pic:blipFill>
-                          <a:blip r:embed="rId48"/>
+                          <a:blip r:embed="rId61"/>
                           <a:stretch>
                             <a:fillRect/>
                           </a:stretch>
@@ -765,21 +1373,21 @@
               <w:pStyle w:val="ImageCaption"/>
             </w:pPr>
             <w:r>
-              <w:t xml:space="preserve">Figure 6: Inflation Dispersion - Last 3 Years (Normalized)</w:t>
-            </w:r>
-          </w:p>
-          <w:bookmarkEnd w:id="51"/>
+              <w:t xml:space="preserve">Figure 8: Inflation Dispersion - Last 3 Years (Normalized)</w:t>
+            </w:r>
+          </w:p>
+          <w:bookmarkEnd w:id="64"/>
         </w:tc>
       </w:tr>
     </w:tbl>
-    <w:bookmarkEnd w:id="52"/>
-    <w:bookmarkStart w:id="57" w:name="distribution-over-time-absolute-counts"/>
+    <w:bookmarkEnd w:id="65"/>
+    <w:bookmarkStart w:id="70" w:name="distribution-over-time-absolute-counts"/>
     <w:p>
       <w:pPr>
         <w:pStyle w:val="Heading2"/>
       </w:pPr>
       <w:r>
-        <w:t xml:space="preserve">3.3 Distribution Over Time (Absolute Counts)</w:t>
+        <w:t xml:space="preserve">4.3 Distribution Over Time (Absolute Counts)</w:t>
       </w:r>
     </w:p>
     <w:tbl>
@@ -795,7 +1403,7 @@
       <w:tr>
         <w:tc>
           <w:tcPr/>
-          <w:bookmarkStart w:id="56" w:name="fig-dispersion-absolute"/>
+          <w:bookmarkStart w:id="69" w:name="fig-dispersion-absolute"/>
           <w:p>
             <w:pPr>
               <w:pStyle w:val="Compact"/>
@@ -806,18 +1414,18 @@
                 <wp:inline>
                   <wp:extent cx="5334000" cy="3035414"/>
                   <wp:effectExtent b="0" l="0" r="0" t="0"/>
-                  <wp:docPr descr="" title="" id="54" name="Picture"/>
+                  <wp:docPr descr="" title="" id="67" name="Picture"/>
                   <a:graphic>
                     <a:graphicData uri="http://schemas.openxmlformats.org/drawingml/2006/picture">
                       <pic:pic>
                         <pic:nvPicPr>
-                          <pic:cNvPr descr="inflation_analysis_files/figure-docx/fig-dispersion-absolute-output-1.png" id="55" name="Picture"/>
+                          <pic:cNvPr descr="inflation_analysis_files/figure-docx/fig-dispersion-absolute-output-1.png" id="68" name="Picture"/>
                           <pic:cNvPicPr>
                             <a:picLocks noChangeArrowheads="1" noChangeAspect="1"/>
                           </pic:cNvPicPr>
                         </pic:nvPicPr>
                         <pic:blipFill>
-                          <a:blip r:embed="rId53"/>
+                          <a:blip r:embed="rId66"/>
                           <a:stretch>
                             <a:fillRect/>
                           </a:stretch>
@@ -854,21 +1462,21 @@
               <w:pStyle w:val="ImageCaption"/>
             </w:pPr>
             <w:r>
-              <w:t xml:space="preserve">Figure 7: Inflation Dispersion - Absolute Count of CPI Components by Bracket</w:t>
-            </w:r>
-          </w:p>
-          <w:bookmarkEnd w:id="56"/>
+              <w:t xml:space="preserve">Figure 9: Inflation Dispersion - Absolute Count of CPI Components by Bracket</w:t>
+            </w:r>
+          </w:p>
+          <w:bookmarkEnd w:id="69"/>
         </w:tc>
       </w:tr>
     </w:tbl>
-    <w:bookmarkEnd w:id="57"/>
-    <w:bookmarkStart w:id="62" w:name="recent-trends-last-3-years---absolute"/>
+    <w:bookmarkEnd w:id="70"/>
+    <w:bookmarkStart w:id="75" w:name="recent-trends-last-3-years---absolute"/>
     <w:p>
       <w:pPr>
         <w:pStyle w:val="Heading2"/>
       </w:pPr>
       <w:r>
-        <w:t xml:space="preserve">3.4 Recent Trends (Last 3 Years - Absolute)</w:t>
+        <w:t xml:space="preserve">4.4 Recent Trends (Last 3 Years - Absolute)</w:t>
       </w:r>
     </w:p>
     <w:tbl>
@@ -884,7 +1492,7 @@
       <w:tr>
         <w:tc>
           <w:tcPr/>
-          <w:bookmarkStart w:id="61" w:name="fig-dispersion-absolute-3yr"/>
+          <w:bookmarkStart w:id="74" w:name="fig-dispersion-absolute-3yr"/>
           <w:p>
             <w:pPr>
               <w:pStyle w:val="Compact"/>
@@ -895,18 +1503,18 @@
                 <wp:inline>
                   <wp:extent cx="5334000" cy="3044557"/>
                   <wp:effectExtent b="0" l="0" r="0" t="0"/>
-                  <wp:docPr descr="" title="" id="59" name="Picture"/>
+                  <wp:docPr descr="" title="" id="72" name="Picture"/>
                   <a:graphic>
                     <a:graphicData uri="http://schemas.openxmlformats.org/drawingml/2006/picture">
                       <pic:pic>
                         <pic:nvPicPr>
-                          <pic:cNvPr descr="inflation_analysis_files/figure-docx/fig-dispersion-absolute-3yr-output-1.png" id="60" name="Picture"/>
+                          <pic:cNvPr descr="inflation_analysis_files/figure-docx/fig-dispersion-absolute-3yr-output-1.png" id="73" name="Picture"/>
                           <pic:cNvPicPr>
                             <a:picLocks noChangeArrowheads="1" noChangeAspect="1"/>
                           </pic:cNvPicPr>
                         </pic:nvPicPr>
                         <pic:blipFill>
-                          <a:blip r:embed="rId58"/>
+                          <a:blip r:embed="rId71"/>
                           <a:stretch>
                             <a:fillRect/>
                           </a:stretch>
@@ -943,30 +1551,30 @@
               <w:pStyle w:val="ImageCaption"/>
             </w:pPr>
             <w:r>
-              <w:t xml:space="preserve">Figure 8: Inflation Dispersion - Last 3 Years (Absolute Counts)</w:t>
-            </w:r>
-          </w:p>
-          <w:bookmarkEnd w:id="61"/>
+              <w:t xml:space="preserve">Figure 10: Inflation Dispersion - Last 3 Years (Absolute Counts)</w:t>
+            </w:r>
+          </w:p>
+          <w:bookmarkEnd w:id="74"/>
         </w:tc>
       </w:tr>
     </w:tbl>
-    <w:bookmarkEnd w:id="62"/>
-    <w:bookmarkStart w:id="79" w:name="annualized-mom-threshold-analysis"/>
+    <w:bookmarkEnd w:id="75"/>
+    <w:bookmarkStart w:id="92" w:name="annualized-mom-threshold-analysis"/>
     <w:p>
       <w:pPr>
         <w:pStyle w:val="Heading2"/>
       </w:pPr>
       <w:r>
-        <w:t xml:space="preserve">3.5 Annualized MoM Threshold Analysis</w:t>
-      </w:r>
-    </w:p>
-    <w:bookmarkStart w:id="67" w:name="annualized-threshold-0.5-mom"/>
+        <w:t xml:space="preserve">4.5 Annualized MoM Threshold Analysis</w:t>
+      </w:r>
+    </w:p>
+    <w:bookmarkStart w:id="80" w:name="annualized-threshold-0.5-mom"/>
     <w:p>
       <w:pPr>
         <w:pStyle w:val="Heading3"/>
       </w:pPr>
       <w:r>
-        <w:t xml:space="preserve">3.5.1 6% Annualized Threshold (0.5% MoM)</w:t>
+        <w:t xml:space="preserve">4.5.1 6% Annualized Threshold (0.5% MoM)</w:t>
       </w:r>
     </w:p>
     <w:tbl>
@@ -982,7 +1590,7 @@
       <w:tr>
         <w:tc>
           <w:tcPr/>
-          <w:bookmarkStart w:id="66" w:name="fig-mom-threshold-6"/>
+          <w:bookmarkStart w:id="79" w:name="fig-mom-threshold-6"/>
           <w:p>
             <w:pPr>
               <w:pStyle w:val="Compact"/>
@@ -993,18 +1601,18 @@
                 <wp:inline>
                   <wp:extent cx="5334000" cy="2474497"/>
                   <wp:effectExtent b="0" l="0" r="0" t="0"/>
-                  <wp:docPr descr="" title="" id="64" name="Picture"/>
+                  <wp:docPr descr="" title="" id="77" name="Picture"/>
                   <a:graphic>
                     <a:graphicData uri="http://schemas.openxmlformats.org/drawingml/2006/picture">
                       <pic:pic>
                         <pic:nvPicPr>
-                          <pic:cNvPr descr="inflation_analysis_files/figure-docx/fig-mom-threshold-6-output-1.png" id="65" name="Picture"/>
+                          <pic:cNvPr descr="inflation_analysis_files/figure-docx/fig-mom-threshold-6-output-1.png" id="78" name="Picture"/>
                           <pic:cNvPicPr>
                             <a:picLocks noChangeArrowheads="1" noChangeAspect="1"/>
                           </pic:cNvPicPr>
                         </pic:nvPicPr>
                         <pic:blipFill>
-                          <a:blip r:embed="rId63"/>
+                          <a:blip r:embed="rId76"/>
                           <a:stretch>
                             <a:fillRect/>
                           </a:stretch>
@@ -1041,21 +1649,21 @@
               <w:pStyle w:val="ImageCaption"/>
             </w:pPr>
             <w:r>
-              <w:t xml:space="preserve">Figure 9: Inflation Breadth: Share of Components Above/Below 6% Annualized Pace</w:t>
-            </w:r>
-          </w:p>
-          <w:bookmarkEnd w:id="66"/>
+              <w:t xml:space="preserve">Figure 11: Inflation Breadth: Share of Components Above/Below 6% Annualized Pace</w:t>
+            </w:r>
+          </w:p>
+          <w:bookmarkEnd w:id="79"/>
         </w:tc>
       </w:tr>
     </w:tbl>
-    <w:bookmarkEnd w:id="67"/>
-    <w:bookmarkStart w:id="72" w:name="annualized-threshold-0.33-mom"/>
+    <w:bookmarkEnd w:id="80"/>
+    <w:bookmarkStart w:id="85" w:name="annualized-threshold-0.33-mom"/>
     <w:p>
       <w:pPr>
         <w:pStyle w:val="Heading3"/>
       </w:pPr>
       <w:r>
-        <w:t xml:space="preserve">3.5.2 4% Annualized Threshold (0.33% MoM)</w:t>
+        <w:t xml:space="preserve">4.5.2 4% Annualized Threshold (0.33% MoM)</w:t>
       </w:r>
     </w:p>
     <w:tbl>
@@ -1071,7 +1679,7 @@
       <w:tr>
         <w:tc>
           <w:tcPr/>
-          <w:bookmarkStart w:id="71" w:name="fig-mom-threshold-4"/>
+          <w:bookmarkStart w:id="84" w:name="fig-mom-threshold-4"/>
           <w:p>
             <w:pPr>
               <w:pStyle w:val="Compact"/>
@@ -1082,18 +1690,18 @@
                 <wp:inline>
                   <wp:extent cx="5334000" cy="2474497"/>
                   <wp:effectExtent b="0" l="0" r="0" t="0"/>
-                  <wp:docPr descr="" title="" id="69" name="Picture"/>
+                  <wp:docPr descr="" title="" id="82" name="Picture"/>
                   <a:graphic>
                     <a:graphicData uri="http://schemas.openxmlformats.org/drawingml/2006/picture">
                       <pic:pic>
                         <pic:nvPicPr>
-                          <pic:cNvPr descr="inflation_analysis_files/figure-docx/fig-mom-threshold-4-output-1.png" id="70" name="Picture"/>
+                          <pic:cNvPr descr="inflation_analysis_files/figure-docx/fig-mom-threshold-4-output-1.png" id="83" name="Picture"/>
                           <pic:cNvPicPr>
                             <a:picLocks noChangeArrowheads="1" noChangeAspect="1"/>
                           </pic:cNvPicPr>
                         </pic:nvPicPr>
                         <pic:blipFill>
-                          <a:blip r:embed="rId68"/>
+                          <a:blip r:embed="rId81"/>
                           <a:stretch>
                             <a:fillRect/>
                           </a:stretch>
@@ -1130,47 +1738,47 @@
               <w:pStyle w:val="ImageCaption"/>
             </w:pPr>
             <w:r>
-              <w:t xml:space="preserve">Figure 10: Inflation Breadth: Share of Components Above/Below 4% Annualized Pace</w:t>
-            </w:r>
-          </w:p>
-          <w:bookmarkEnd w:id="71"/>
+              <w:t xml:space="preserve">Figure 12: Inflation Breadth: Share of Components Above/Below 4% Annualized Pace</w:t>
+            </w:r>
+          </w:p>
+          <w:bookmarkEnd w:id="84"/>
         </w:tc>
       </w:tr>
     </w:tbl>
-    <w:bookmarkEnd w:id="72"/>
-    <w:bookmarkStart w:id="73" w:name="mom-threshold-insights"/>
+    <w:bookmarkEnd w:id="85"/>
+    <w:bookmarkStart w:id="86" w:name="mom-threshold-insights"/>
     <w:p>
       <w:pPr>
         <w:pStyle w:val="Heading3"/>
       </w:pPr>
       <w:r>
-        <w:t xml:space="preserve">3.5.3 MoM Threshold Insights</w:t>
-      </w:r>
-    </w:p>
-    <w:bookmarkEnd w:id="73"/>
-    <w:bookmarkStart w:id="78" w:name="current-month-october-2025"/>
+        <w:t xml:space="preserve">4.5.3 MoM Threshold Insights</w:t>
+      </w:r>
+    </w:p>
+    <w:bookmarkEnd w:id="86"/>
+    <w:bookmarkStart w:id="91" w:name="current-month-october-2025-1"/>
     <w:p>
       <w:pPr>
         <w:pStyle w:val="Heading3"/>
       </w:pPr>
       <w:r>
-        <w:t xml:space="preserve">3.5.4 Current Month (October 2025)</w:t>
-      </w:r>
-    </w:p>
-    <w:bookmarkStart w:id="74" w:name="annualized-threshold"/>
+        <w:t xml:space="preserve">4.5.4 Current Month (October 2025)</w:t>
+      </w:r>
+    </w:p>
+    <w:bookmarkStart w:id="87" w:name="annualized-threshold"/>
     <w:p>
       <w:pPr>
         <w:pStyle w:val="Heading4"/>
       </w:pPr>
       <w:r>
-        <w:t xml:space="preserve">3.5.4.1 6% Annualized Threshold</w:t>
+        <w:t xml:space="preserve">4.5.4.1 6% Annualized Threshold</w:t>
       </w:r>
     </w:p>
     <w:p>
       <w:pPr>
         <w:numPr>
           <w:ilvl w:val="0"/>
-          <w:numId w:val="1003"/>
+          <w:numId w:val="1004"/>
         </w:numPr>
       </w:pPr>
       <w:r>
@@ -1178,20 +1786,20 @@
           <w:b/>
           <w:bCs/>
         </w:rPr>
-        <w:t xml:space="preserve">17.1%</w:t>
+        <w:t xml:space="preserve">17.7%</w:t>
       </w:r>
       <w:r>
         <w:t xml:space="preserve"> </w:t>
       </w:r>
       <w:r>
-        <w:t xml:space="preserve">(55 components) are currently inflating above the 6% annualized pace (&gt;0.5% MoM)</w:t>
+        <w:t xml:space="preserve">(58 components) are currently inflating above the 6% annualized pace (&gt;0.5% MoM)</w:t>
       </w:r>
     </w:p>
     <w:p>
       <w:pPr>
         <w:numPr>
           <w:ilvl w:val="0"/>
-          <w:numId w:val="1003"/>
+          <w:numId w:val="1004"/>
         </w:numPr>
       </w:pPr>
       <w:r>
@@ -1227,21 +1835,21 @@
         <w:t xml:space="preserve">with most components cooling</w:t>
       </w:r>
     </w:p>
-    <w:bookmarkEnd w:id="74"/>
-    <w:bookmarkStart w:id="75" w:name="annualized-threshold-1"/>
+    <w:bookmarkEnd w:id="87"/>
+    <w:bookmarkStart w:id="88" w:name="annualized-threshold-1"/>
     <w:p>
       <w:pPr>
         <w:pStyle w:val="Heading4"/>
       </w:pPr>
       <w:r>
-        <w:t xml:space="preserve">3.5.4.2 4% Annualized Threshold</w:t>
+        <w:t xml:space="preserve">4.5.4.2 4% Annualized Threshold</w:t>
       </w:r>
     </w:p>
     <w:p>
       <w:pPr>
         <w:numPr>
           <w:ilvl w:val="0"/>
-          <w:numId w:val="1004"/>
+          <w:numId w:val="1005"/>
         </w:numPr>
       </w:pPr>
       <w:r>
@@ -1249,20 +1857,20 @@
           <w:b/>
           <w:bCs/>
         </w:rPr>
-        <w:t xml:space="preserve">22.7%</w:t>
+        <w:t xml:space="preserve">23.2%</w:t>
       </w:r>
       <w:r>
         <w:t xml:space="preserve"> </w:t>
       </w:r>
       <w:r>
-        <w:t xml:space="preserve">(73 components) are inflating above the 4% annualized pace (&gt;0.33% MoM)</w:t>
+        <w:t xml:space="preserve">(76 components) are inflating above the 4% annualized pace (&gt;0.33% MoM)</w:t>
       </w:r>
     </w:p>
     <w:p>
       <w:pPr>
         <w:numPr>
           <w:ilvl w:val="0"/>
-          <w:numId w:val="1004"/>
+          <w:numId w:val="1005"/>
         </w:numPr>
       </w:pPr>
       <w:r>
@@ -1292,21 +1900,21 @@
         <w:t xml:space="preserve">policy easing</w:t>
       </w:r>
     </w:p>
-    <w:bookmarkEnd w:id="75"/>
-    <w:bookmarkStart w:id="76" w:name="change-from-year-ago-october-2024"/>
+    <w:bookmarkEnd w:id="88"/>
+    <w:bookmarkStart w:id="89" w:name="change-from-year-ago-october-2024"/>
     <w:p>
       <w:pPr>
         <w:pStyle w:val="Heading4"/>
       </w:pPr>
       <w:r>
-        <w:t xml:space="preserve">3.5.4.3 Change from Year Ago (October 2024)</w:t>
+        <w:t xml:space="preserve">4.5.4.3 Change from Year Ago (October 2024)</w:t>
       </w:r>
     </w:p>
     <w:p>
       <w:pPr>
         <w:numPr>
           <w:ilvl w:val="0"/>
-          <w:numId w:val="1005"/>
+          <w:numId w:val="1006"/>
         </w:numPr>
       </w:pPr>
       <w:r>
@@ -1327,7 +1935,7 @@
       <w:pPr>
         <w:numPr>
           <w:ilvl w:val="0"/>
-          <w:numId w:val="1005"/>
+          <w:numId w:val="1006"/>
         </w:numPr>
       </w:pPr>
       <w:r>
@@ -1341,24 +1949,24 @@
           <w:b/>
           <w:bCs/>
         </w:rPr>
-        <w:t xml:space="preserve">decreased by 22.1 percentage points</w:t>
-      </w:r>
-    </w:p>
-    <w:bookmarkEnd w:id="76"/>
-    <w:bookmarkStart w:id="77" w:name="month-trend"/>
+        <w:t xml:space="preserve">decreased by 22.0 percentage points</w:t>
+      </w:r>
+    </w:p>
+    <w:bookmarkEnd w:id="89"/>
+    <w:bookmarkStart w:id="90" w:name="month-trend"/>
     <w:p>
       <w:pPr>
         <w:pStyle w:val="Heading4"/>
       </w:pPr>
       <w:r>
-        <w:t xml:space="preserve">3.5.4.4 12-Month Trend</w:t>
+        <w:t xml:space="preserve">4.5.4.4 12-Month Trend</w:t>
       </w:r>
     </w:p>
     <w:p>
       <w:pPr>
         <w:numPr>
           <w:ilvl w:val="0"/>
-          <w:numId w:val="1006"/>
+          <w:numId w:val="1007"/>
         </w:numPr>
       </w:pPr>
       <w:r>
@@ -1385,7 +1993,7 @@
       <w:pPr>
         <w:numPr>
           <w:ilvl w:val="0"/>
-          <w:numId w:val="1006"/>
+          <w:numId w:val="1007"/>
         </w:numPr>
       </w:pPr>
       <w:r>
@@ -1408,32 +2016,32 @@
         <w:t xml:space="preserve">over the past year</w:t>
       </w:r>
     </w:p>
-    <w:bookmarkEnd w:id="77"/>
-    <w:bookmarkEnd w:id="78"/>
-    <w:bookmarkEnd w:id="79"/>
-    <w:bookmarkStart w:id="82" w:name="key-insights"/>
+    <w:bookmarkEnd w:id="90"/>
+    <w:bookmarkEnd w:id="91"/>
+    <w:bookmarkEnd w:id="92"/>
+    <w:bookmarkStart w:id="95" w:name="key-insights-1"/>
     <w:p>
       <w:pPr>
         <w:pStyle w:val="Heading2"/>
       </w:pPr>
       <w:r>
-        <w:t xml:space="preserve">3.6 Key Insights</w:t>
-      </w:r>
-    </w:p>
-    <w:bookmarkStart w:id="80" w:name="current-month-october-2025-1"/>
+        <w:t xml:space="preserve">4.6 Key Insights</w:t>
+      </w:r>
+    </w:p>
+    <w:bookmarkStart w:id="93" w:name="current-month-october-2025-2"/>
     <w:p>
       <w:pPr>
         <w:pStyle w:val="Heading3"/>
       </w:pPr>
       <w:r>
-        <w:t xml:space="preserve">3.6.1 Current Month (October 2025)</w:t>
+        <w:t xml:space="preserve">4.6.1 Current Month (October 2025)</w:t>
       </w:r>
     </w:p>
     <w:p>
       <w:pPr>
         <w:numPr>
           <w:ilvl w:val="0"/>
-          <w:numId w:val="1007"/>
+          <w:numId w:val="1008"/>
         </w:numPr>
       </w:pPr>
       <w:r>
@@ -1441,7 +2049,7 @@
           <w:b/>
           <w:bCs/>
         </w:rPr>
-        <w:t xml:space="preserve">11.2%</w:t>
+        <w:t xml:space="preserve">11.3%</w:t>
       </w:r>
       <w:r>
         <w:t xml:space="preserve"> </w:t>
@@ -1454,7 +2062,7 @@
       <w:pPr>
         <w:numPr>
           <w:ilvl w:val="0"/>
-          <w:numId w:val="1007"/>
+          <w:numId w:val="1008"/>
         </w:numPr>
       </w:pPr>
       <w:r>
@@ -1462,7 +2070,7 @@
           <w:b/>
           <w:bCs/>
         </w:rPr>
-        <w:t xml:space="preserve">12.8%</w:t>
+        <w:t xml:space="preserve">13.1%</w:t>
       </w:r>
       <w:r>
         <w:t xml:space="preserve"> </w:t>
@@ -1475,7 +2083,7 @@
       <w:pPr>
         <w:numPr>
           <w:ilvl w:val="0"/>
-          <w:numId w:val="1007"/>
+          <w:numId w:val="1008"/>
         </w:numPr>
       </w:pPr>
       <w:r>
@@ -1483,7 +2091,7 @@
           <w:b/>
           <w:bCs/>
         </w:rPr>
-        <w:t xml:space="preserve">76.0%</w:t>
+        <w:t xml:space="preserve">75.5%</w:t>
       </w:r>
       <w:r>
         <w:t xml:space="preserve"> </w:t>
@@ -1496,7 +2104,7 @@
       <w:pPr>
         <w:numPr>
           <w:ilvl w:val="0"/>
-          <w:numId w:val="1007"/>
+          <w:numId w:val="1008"/>
         </w:numPr>
       </w:pPr>
       <w:r>
@@ -1526,7 +2134,7 @@
           <w:b/>
           <w:bCs/>
         </w:rPr>
-        <w:t xml:space="preserve">28.0%</w:t>
+        <w:t xml:space="preserve">27.5%</w:t>
       </w:r>
       <w:r>
         <w:t xml:space="preserve"> </w:t>
@@ -1535,14 +2143,14 @@
         <w:t xml:space="preserve">of all components</w:t>
       </w:r>
     </w:p>
-    <w:bookmarkEnd w:id="80"/>
-    <w:bookmarkStart w:id="81" w:name="change-from-year-ago-october-2024-1"/>
+    <w:bookmarkEnd w:id="93"/>
+    <w:bookmarkStart w:id="94" w:name="change-from-year-ago-october-2024-1"/>
     <w:p>
       <w:pPr>
         <w:pStyle w:val="Heading3"/>
       </w:pPr>
       <w:r>
-        <w:t xml:space="preserve">3.6.2 Change from Year Ago (October 2024)</w:t>
+        <w:t xml:space="preserve">4.6.2 Change from Year Ago (October 2024)</w:t>
       </w:r>
     </w:p>
     <w:p>
@@ -1550,7 +2158,7 @@
         <w:pStyle w:val="Compact"/>
         <w:numPr>
           <w:ilvl w:val="0"/>
-          <w:numId w:val="1008"/>
+          <w:numId w:val="1009"/>
         </w:numPr>
       </w:pPr>
       <w:r>
@@ -1567,25 +2175,25 @@
         <w:t xml:space="preserve">stable</w:t>
       </w:r>
     </w:p>
-    <w:bookmarkEnd w:id="81"/>
-    <w:bookmarkEnd w:id="82"/>
-    <w:bookmarkEnd w:id="83"/>
-    <w:bookmarkStart w:id="106" w:name="seasonality-analysis"/>
+    <w:bookmarkEnd w:id="94"/>
+    <w:bookmarkEnd w:id="95"/>
+    <w:bookmarkEnd w:id="96"/>
+    <w:bookmarkStart w:id="119" w:name="seasonality-analysis"/>
     <w:p>
       <w:pPr>
         <w:pStyle w:val="Heading1"/>
       </w:pPr>
       <w:r>
-        <w:t xml:space="preserve">4. Seasonality Analysis</w:t>
-      </w:r>
-    </w:p>
-    <w:bookmarkStart w:id="88" w:name="cpi-ex-vegetables"/>
+        <w:t xml:space="preserve">5. Seasonality Analysis</w:t>
+      </w:r>
+    </w:p>
+    <w:bookmarkStart w:id="101" w:name="cpi-ex-vegetables"/>
     <w:p>
       <w:pPr>
         <w:pStyle w:val="Heading2"/>
       </w:pPr>
       <w:r>
-        <w:t xml:space="preserve">4.1 CPI Ex Vegetables</w:t>
+        <w:t xml:space="preserve">5.1 CPI Ex Vegetables</w:t>
       </w:r>
     </w:p>
     <w:tbl>
@@ -1601,7 +2209,7 @@
       <w:tr>
         <w:tc>
           <w:tcPr/>
-          <w:bookmarkStart w:id="87" w:name="fig-seasonality-exveggies"/>
+          <w:bookmarkStart w:id="100" w:name="fig-seasonality-exveggies"/>
           <w:p>
             <w:pPr>
               <w:pStyle w:val="Compact"/>
@@ -1612,18 +2220,18 @@
                 <wp:inline>
                   <wp:extent cx="5334000" cy="2667000"/>
                   <wp:effectExtent b="0" l="0" r="0" t="0"/>
-                  <wp:docPr descr="" title="" id="85" name="Picture"/>
+                  <wp:docPr descr="" title="" id="98" name="Picture"/>
                   <a:graphic>
                     <a:graphicData uri="http://schemas.openxmlformats.org/drawingml/2006/picture">
                       <pic:pic>
                         <pic:nvPicPr>
-                          <pic:cNvPr descr="inflation_analysis_files/figure-docx/fig-seasonality-exveggies-output-1.png" id="86" name="Picture"/>
+                          <pic:cNvPr descr="inflation_analysis_files/figure-docx/fig-seasonality-exveggies-output-1.png" id="99" name="Picture"/>
                           <pic:cNvPicPr>
                             <a:picLocks noChangeArrowheads="1" noChangeAspect="1"/>
                           </pic:cNvPicPr>
                         </pic:nvPicPr>
                         <pic:blipFill>
-                          <a:blip r:embed="rId84"/>
+                          <a:blip r:embed="rId97"/>
                           <a:stretch>
                             <a:fillRect/>
                           </a:stretch>
@@ -1660,21 +2268,21 @@
               <w:pStyle w:val="ImageCaption"/>
             </w:pPr>
             <w:r>
-              <w:t xml:space="preserve">Figure 11: CPI Excluding Vegetables - Seasonality Patterns (YoY and MoM)</w:t>
-            </w:r>
-          </w:p>
-          <w:bookmarkEnd w:id="87"/>
+              <w:t xml:space="preserve">Figure 13: CPI Excluding Vegetables - Seasonality Patterns (YoY and MoM)</w:t>
+            </w:r>
+          </w:p>
+          <w:bookmarkEnd w:id="100"/>
         </w:tc>
       </w:tr>
     </w:tbl>
-    <w:bookmarkEnd w:id="88"/>
-    <w:bookmarkStart w:id="93" w:name="core-cpi-ex-food-beverages-fuel"/>
+    <w:bookmarkEnd w:id="101"/>
+    <w:bookmarkStart w:id="106" w:name="core-cpi-ex-food-beverages-fuel"/>
     <w:p>
       <w:pPr>
         <w:pStyle w:val="Heading2"/>
       </w:pPr>
       <w:r>
-        <w:t xml:space="preserve">4.2 Core CPI (Ex Food, Beverages &amp; Fuel)</w:t>
+        <w:t xml:space="preserve">5.2 Core CPI (Ex Food, Beverages &amp; Fuel)</w:t>
       </w:r>
     </w:p>
     <w:tbl>
@@ -1690,7 +2298,7 @@
       <w:tr>
         <w:tc>
           <w:tcPr/>
-          <w:bookmarkStart w:id="92" w:name="fig-seasonality-core"/>
+          <w:bookmarkStart w:id="105" w:name="fig-seasonality-core"/>
           <w:p>
             <w:pPr>
               <w:pStyle w:val="Compact"/>
@@ -1701,18 +2309,18 @@
                 <wp:inline>
                   <wp:extent cx="5334000" cy="2667000"/>
                   <wp:effectExtent b="0" l="0" r="0" t="0"/>
-                  <wp:docPr descr="" title="" id="90" name="Picture"/>
+                  <wp:docPr descr="" title="" id="103" name="Picture"/>
                   <a:graphic>
                     <a:graphicData uri="http://schemas.openxmlformats.org/drawingml/2006/picture">
                       <pic:pic>
                         <pic:nvPicPr>
-                          <pic:cNvPr descr="inflation_analysis_files/figure-docx/fig-seasonality-core-output-1.png" id="91" name="Picture"/>
+                          <pic:cNvPr descr="inflation_analysis_files/figure-docx/fig-seasonality-core-output-1.png" id="104" name="Picture"/>
                           <pic:cNvPicPr>
                             <a:picLocks noChangeArrowheads="1" noChangeAspect="1"/>
                           </pic:cNvPicPr>
                         </pic:nvPicPr>
                         <pic:blipFill>
-                          <a:blip r:embed="rId89"/>
+                          <a:blip r:embed="rId102"/>
                           <a:stretch>
                             <a:fillRect/>
                           </a:stretch>
@@ -1749,21 +2357,21 @@
               <w:pStyle w:val="ImageCaption"/>
             </w:pPr>
             <w:r>
-              <w:t xml:space="preserve">Figure 12: Core CPI (Excluding Food, Beverages &amp; Fuel &amp; Light) - Seasonality Patterns (YoY and MoM)</w:t>
-            </w:r>
-          </w:p>
-          <w:bookmarkEnd w:id="92"/>
+              <w:t xml:space="preserve">Figure 14: Core CPI (Excluding Food, Beverages &amp; Fuel &amp; Light) - Seasonality Patterns (YoY and MoM)</w:t>
+            </w:r>
+          </w:p>
+          <w:bookmarkEnd w:id="105"/>
         </w:tc>
       </w:tr>
     </w:tbl>
-    <w:bookmarkEnd w:id="93"/>
-    <w:bookmarkStart w:id="98" w:name="personal-care-effects"/>
+    <w:bookmarkEnd w:id="106"/>
+    <w:bookmarkStart w:id="111" w:name="personal-care-effects"/>
     <w:p>
       <w:pPr>
         <w:pStyle w:val="Heading2"/>
       </w:pPr>
       <w:r>
-        <w:t xml:space="preserve">4.3 Personal Care &amp; Effects</w:t>
+        <w:t xml:space="preserve">5.3 Personal Care &amp; Effects</w:t>
       </w:r>
     </w:p>
     <w:tbl>
@@ -1779,7 +2387,7 @@
       <w:tr>
         <w:tc>
           <w:tcPr/>
-          <w:bookmarkStart w:id="97" w:name="fig-seasonality-personal"/>
+          <w:bookmarkStart w:id="110" w:name="fig-seasonality-personal"/>
           <w:p>
             <w:pPr>
               <w:pStyle w:val="Compact"/>
@@ -1790,18 +2398,18 @@
                 <wp:inline>
                   <wp:extent cx="5334000" cy="2669358"/>
                   <wp:effectExtent b="0" l="0" r="0" t="0"/>
-                  <wp:docPr descr="" title="" id="95" name="Picture"/>
+                  <wp:docPr descr="" title="" id="108" name="Picture"/>
                   <a:graphic>
                     <a:graphicData uri="http://schemas.openxmlformats.org/drawingml/2006/picture">
                       <pic:pic>
                         <pic:nvPicPr>
-                          <pic:cNvPr descr="inflation_analysis_files/figure-docx/fig-seasonality-personal-output-1.png" id="96" name="Picture"/>
+                          <pic:cNvPr descr="inflation_analysis_files/figure-docx/fig-seasonality-personal-output-1.png" id="109" name="Picture"/>
                           <pic:cNvPicPr>
                             <a:picLocks noChangeArrowheads="1" noChangeAspect="1"/>
                           </pic:cNvPicPr>
                         </pic:nvPicPr>
                         <pic:blipFill>
-                          <a:blip r:embed="rId94"/>
+                          <a:blip r:embed="rId107"/>
                           <a:stretch>
                             <a:fillRect/>
                           </a:stretch>
@@ -1838,21 +2446,21 @@
               <w:pStyle w:val="ImageCaption"/>
             </w:pPr>
             <w:r>
-              <w:t xml:space="preserve">Figure 13: CPI Miscellaneous (Personal Care &amp; Effects) - Seasonality Patterns (YoY and MoM)</w:t>
-            </w:r>
-          </w:p>
-          <w:bookmarkEnd w:id="97"/>
+              <w:t xml:space="preserve">Figure 15: CPI Miscellaneous (Personal Care &amp; Effects) - Seasonality Patterns (YoY and MoM)</w:t>
+            </w:r>
+          </w:p>
+          <w:bookmarkEnd w:id="110"/>
         </w:tc>
       </w:tr>
     </w:tbl>
-    <w:bookmarkEnd w:id="98"/>
-    <w:bookmarkStart w:id="103" w:name="food-price-index"/>
+    <w:bookmarkEnd w:id="111"/>
+    <w:bookmarkStart w:id="116" w:name="food-price-index"/>
     <w:p>
       <w:pPr>
         <w:pStyle w:val="Heading2"/>
       </w:pPr>
       <w:r>
-        <w:t xml:space="preserve">4.4 Food Price Index</w:t>
+        <w:t xml:space="preserve">5.4 Food Price Index</w:t>
       </w:r>
     </w:p>
     <w:tbl>
@@ -1868,7 +2476,7 @@
       <w:tr>
         <w:tc>
           <w:tcPr/>
-          <w:bookmarkStart w:id="102" w:name="fig-seasonality-food"/>
+          <w:bookmarkStart w:id="115" w:name="fig-seasonality-food"/>
           <w:p>
             <w:pPr>
               <w:pStyle w:val="Compact"/>
@@ -1879,18 +2487,18 @@
                 <wp:inline>
                   <wp:extent cx="5334000" cy="2669358"/>
                   <wp:effectExtent b="0" l="0" r="0" t="0"/>
-                  <wp:docPr descr="" title="" id="100" name="Picture"/>
+                  <wp:docPr descr="" title="" id="113" name="Picture"/>
                   <a:graphic>
                     <a:graphicData uri="http://schemas.openxmlformats.org/drawingml/2006/picture">
                       <pic:pic>
                         <pic:nvPicPr>
-                          <pic:cNvPr descr="inflation_analysis_files/figure-docx/fig-seasonality-food-output-1.png" id="101" name="Picture"/>
+                          <pic:cNvPr descr="inflation_analysis_files/figure-docx/fig-seasonality-food-output-1.png" id="114" name="Picture"/>
                           <pic:cNvPicPr>
                             <a:picLocks noChangeArrowheads="1" noChangeAspect="1"/>
                           </pic:cNvPicPr>
                         </pic:nvPicPr>
                         <pic:blipFill>
-                          <a:blip r:embed="rId99"/>
+                          <a:blip r:embed="rId112"/>
                           <a:stretch>
                             <a:fillRect/>
                           </a:stretch>
@@ -1927,21 +2535,21 @@
               <w:pStyle w:val="ImageCaption"/>
             </w:pPr>
             <w:r>
-              <w:t xml:space="preserve">Figure 14: Consumer Food Price Index - Seasonality Patterns (YoY and MoM)</w:t>
-            </w:r>
-          </w:p>
-          <w:bookmarkEnd w:id="102"/>
+              <w:t xml:space="preserve">Figure 16: Consumer Food Price Index - Seasonality Patterns (YoY and MoM)</w:t>
+            </w:r>
+          </w:p>
+          <w:bookmarkEnd w:id="115"/>
         </w:tc>
       </w:tr>
     </w:tbl>
-    <w:bookmarkEnd w:id="103"/>
-    <w:bookmarkStart w:id="104" w:name="cpi-excluding-gold"/>
+    <w:bookmarkEnd w:id="116"/>
+    <w:bookmarkStart w:id="117" w:name="cpi-excluding-gold"/>
     <w:p>
       <w:pPr>
         <w:pStyle w:val="Heading2"/>
       </w:pPr>
       <w:r>
-        <w:t xml:space="preserve">4.5 CPI (Excluding Gold)</w:t>
+        <w:t xml:space="preserve">5.5 CPI (Excluding Gold)</w:t>
       </w:r>
     </w:p>
     <w:p>
@@ -1952,14 +2560,14 @@
         <w:t xml:space="preserve">![Consumer Food Price Index (Excluding Gold)](inflation_analysis_files/figure-docx/fig-seasonality-cpi-(ex-gold-output-1.png){#fig-seasonality-cpi-(ex-gold}</w:t>
       </w:r>
     </w:p>
-    <w:bookmarkEnd w:id="104"/>
-    <w:bookmarkStart w:id="105" w:name="cpi-excluding-gold-and-silver"/>
+    <w:bookmarkEnd w:id="117"/>
+    <w:bookmarkStart w:id="118" w:name="cpi-excluding-gold-and-silver"/>
     <w:p>
       <w:pPr>
         <w:pStyle w:val="Heading2"/>
       </w:pPr>
       <w:r>
-        <w:t xml:space="preserve">4.6 CPI (Excluding Gold and Silver)</w:t>
+        <w:t xml:space="preserve">5.6 CPI (Excluding Gold and Silver)</w:t>
       </w:r>
     </w:p>
     <w:p>
@@ -1970,24 +2578,24 @@
         <w:t xml:space="preserve">![Consumer Food Price Index (Excluding Gol and Silver)](inflation_analysis_files/figure-docx/fig-seasonality-cpi-(ex-gold-and-silver-output-1.png){#fig-seasonality-cpi-(ex-gold-and-silver}</w:t>
       </w:r>
     </w:p>
-    <w:bookmarkEnd w:id="105"/>
-    <w:bookmarkEnd w:id="106"/>
-    <w:bookmarkStart w:id="122" w:name="inflation-trends-over-time"/>
+    <w:bookmarkEnd w:id="118"/>
+    <w:bookmarkEnd w:id="119"/>
+    <w:bookmarkStart w:id="135" w:name="inflation-trends-over-time"/>
     <w:p>
       <w:pPr>
         <w:pStyle w:val="Heading1"/>
       </w:pPr>
       <w:r>
-        <w:t xml:space="preserve">5. Inflation Trends Over Time</w:t>
-      </w:r>
-    </w:p>
-    <w:bookmarkStart w:id="111" w:name="recent-trends-last-7-years"/>
+        <w:t xml:space="preserve">6. Inflation Trends Over Time</w:t>
+      </w:r>
+    </w:p>
+    <w:bookmarkStart w:id="124" w:name="recent-trends-last-7-years"/>
     <w:p>
       <w:pPr>
         <w:pStyle w:val="Heading2"/>
       </w:pPr>
       <w:r>
-        <w:t xml:space="preserve">5.1 Recent Trends (Last 7 Years)</w:t>
+        <w:t xml:space="preserve">6.1 Recent Trends (Last 7 Years)</w:t>
       </w:r>
     </w:p>
     <w:tbl>
@@ -2003,7 +2611,7 @@
       <w:tr>
         <w:tc>
           <w:tcPr/>
-          <w:bookmarkStart w:id="110" w:name="fig-yoy-trends"/>
+          <w:bookmarkStart w:id="123" w:name="fig-yoy-trends"/>
           <w:p>
             <w:pPr>
               <w:pStyle w:val="Compact"/>
@@ -2012,20 +2620,20 @@
             <w:r>
               <w:drawing>
                 <wp:inline>
-                  <wp:extent cx="5334000" cy="2650981"/>
+                  <wp:extent cx="5334000" cy="2652973"/>
                   <wp:effectExtent b="0" l="0" r="0" t="0"/>
-                  <wp:docPr descr="" title="" id="108" name="Picture"/>
+                  <wp:docPr descr="" title="" id="121" name="Picture"/>
                   <a:graphic>
                     <a:graphicData uri="http://schemas.openxmlformats.org/drawingml/2006/picture">
                       <pic:pic>
                         <pic:nvPicPr>
-                          <pic:cNvPr descr="inflation_analysis_files/figure-docx/fig-yoy-trends-output-1.png" id="109" name="Picture"/>
+                          <pic:cNvPr descr="inflation_analysis_files/figure-docx/fig-yoy-trends-output-1.png" id="122" name="Picture"/>
                           <pic:cNvPicPr>
                             <a:picLocks noChangeArrowheads="1" noChangeAspect="1"/>
                           </pic:cNvPicPr>
                         </pic:nvPicPr>
                         <pic:blipFill>
-                          <a:blip r:embed="rId107"/>
+                          <a:blip r:embed="rId120"/>
                           <a:stretch>
                             <a:fillRect/>
                           </a:stretch>
@@ -2033,7 +2641,7 @@
                         <pic:spPr bwMode="auto">
                           <a:xfrm>
                             <a:off x="0" y="0"/>
-                            <a:ext cx="5334000" cy="2650981"/>
+                            <a:ext cx="5334000" cy="2652973"/>
                           </a:xfrm>
                           <a:prstGeom prst="rect">
                             <a:avLst/>
@@ -2062,21 +2670,21 @@
               <w:pStyle w:val="ImageCaption"/>
             </w:pPr>
             <w:r>
-              <w:t xml:space="preserve">Figure 15: Year-on-Year Inflation Trends - CPI Categories Comparison</w:t>
-            </w:r>
-          </w:p>
-          <w:bookmarkEnd w:id="110"/>
+              <w:t xml:space="preserve">Figure 17: Year-on-Year Inflation Trends - CPI Categories Comparison</w:t>
+            </w:r>
+          </w:p>
+          <w:bookmarkEnd w:id="123"/>
         </w:tc>
       </w:tr>
     </w:tbl>
-    <w:bookmarkEnd w:id="111"/>
-    <w:bookmarkStart w:id="116" w:name="month-on-month-trend"/>
+    <w:bookmarkEnd w:id="124"/>
+    <w:bookmarkStart w:id="129" w:name="month-on-month-trend"/>
     <w:p>
       <w:pPr>
         <w:pStyle w:val="Heading2"/>
       </w:pPr>
       <w:r>
-        <w:t xml:space="preserve">5.2 Month on Month Trend</w:t>
+        <w:t xml:space="preserve">6.2 Month on Month Trend</w:t>
       </w:r>
     </w:p>
     <w:tbl>
@@ -2092,7 +2700,7 @@
       <w:tr>
         <w:tc>
           <w:tcPr/>
-          <w:bookmarkStart w:id="115" w:name="fig-mom-trends"/>
+          <w:bookmarkStart w:id="128" w:name="fig-mom-trends"/>
           <w:p>
             <w:pPr>
               <w:pStyle w:val="Compact"/>
@@ -2103,18 +2711,18 @@
                 <wp:inline>
                   <wp:extent cx="5334000" cy="2647007"/>
                   <wp:effectExtent b="0" l="0" r="0" t="0"/>
-                  <wp:docPr descr="" title="" id="113" name="Picture"/>
+                  <wp:docPr descr="" title="" id="126" name="Picture"/>
                   <a:graphic>
                     <a:graphicData uri="http://schemas.openxmlformats.org/drawingml/2006/picture">
                       <pic:pic>
                         <pic:nvPicPr>
-                          <pic:cNvPr descr="inflation_analysis_files/figure-docx/fig-mom-trends-output-1.png" id="114" name="Picture"/>
+                          <pic:cNvPr descr="inflation_analysis_files/figure-docx/fig-mom-trends-output-1.png" id="127" name="Picture"/>
                           <pic:cNvPicPr>
                             <a:picLocks noChangeArrowheads="1" noChangeAspect="1"/>
                           </pic:cNvPicPr>
                         </pic:nvPicPr>
                         <pic:blipFill>
-                          <a:blip r:embed="rId112"/>
+                          <a:blip r:embed="rId125"/>
                           <a:stretch>
                             <a:fillRect/>
                           </a:stretch>
@@ -2151,21 +2759,21 @@
               <w:pStyle w:val="ImageCaption"/>
             </w:pPr>
             <w:r>
-              <w:t xml:space="preserve">Figure 16: Month-on-Month Inflation Trends - CPI Categories Comparison</w:t>
-            </w:r>
-          </w:p>
-          <w:bookmarkEnd w:id="115"/>
+              <w:t xml:space="preserve">Figure 18: Month-on-Month Inflation Trends - CPI Categories Comparison</w:t>
+            </w:r>
+          </w:p>
+          <w:bookmarkEnd w:id="128"/>
         </w:tc>
       </w:tr>
     </w:tbl>
-    <w:bookmarkEnd w:id="116"/>
-    <w:bookmarkStart w:id="121" w:name="historical-overview"/>
+    <w:bookmarkEnd w:id="129"/>
+    <w:bookmarkStart w:id="134" w:name="historical-overview"/>
     <w:p>
       <w:pPr>
         <w:pStyle w:val="Heading2"/>
       </w:pPr>
       <w:r>
-        <w:t xml:space="preserve">5.3 Historical Overview</w:t>
+        <w:t xml:space="preserve">6.3 Historical Overview</w:t>
       </w:r>
     </w:p>
     <w:tbl>
@@ -2181,7 +2789,7 @@
       <w:tr>
         <w:tc>
           <w:tcPr/>
-          <w:bookmarkStart w:id="120" w:name="fig-yoy-trends-full"/>
+          <w:bookmarkStart w:id="133" w:name="fig-yoy-trends-full"/>
           <w:p>
             <w:pPr>
               <w:pStyle w:val="Compact"/>
@@ -2192,18 +2800,18 @@
                 <wp:inline>
                   <wp:extent cx="5334000" cy="2647007"/>
                   <wp:effectExtent b="0" l="0" r="0" t="0"/>
-                  <wp:docPr descr="" title="" id="118" name="Picture"/>
+                  <wp:docPr descr="" title="" id="131" name="Picture"/>
                   <a:graphic>
                     <a:graphicData uri="http://schemas.openxmlformats.org/drawingml/2006/picture">
                       <pic:pic>
                         <pic:nvPicPr>
-                          <pic:cNvPr descr="inflation_analysis_files/figure-docx/fig-yoy-trends-full-output-1.png" id="119" name="Picture"/>
+                          <pic:cNvPr descr="inflation_analysis_files/figure-docx/fig-yoy-trends-full-output-1.png" id="132" name="Picture"/>
                           <pic:cNvPicPr>
                             <a:picLocks noChangeArrowheads="1" noChangeAspect="1"/>
                           </pic:cNvPicPr>
                         </pic:nvPicPr>
                         <pic:blipFill>
-                          <a:blip r:embed="rId117"/>
+                          <a:blip r:embed="rId130"/>
                           <a:stretch>
                             <a:fillRect/>
                           </a:stretch>
@@ -2240,15 +2848,15 @@
               <w:pStyle w:val="ImageCaption"/>
             </w:pPr>
             <w:r>
-              <w:t xml:space="preserve">Figure 17: Year-on-Year Inflation Trends - Complete Historical Data</w:t>
-            </w:r>
-          </w:p>
-          <w:bookmarkEnd w:id="120"/>
+              <w:t xml:space="preserve">Figure 19: Year-on-Year Inflation Trends - Complete Historical Data</w:t>
+            </w:r>
+          </w:p>
+          <w:bookmarkEnd w:id="133"/>
         </w:tc>
       </w:tr>
     </w:tbl>
-    <w:bookmarkEnd w:id="121"/>
-    <w:bookmarkEnd w:id="122"/>
+    <w:bookmarkEnd w:id="134"/>
+    <w:bookmarkEnd w:id="135"/>
     <w:sectPr>
       <w:footnotePr>
         <w:numRestart w:val="eachSect"/>
@@ -2487,6 +3095,9 @@
     <w:abstractNumId w:val="991"/>
   </w:num>
   <w:num w:numId="1008">
+    <w:abstractNumId w:val="991"/>
+  </w:num>
+  <w:num w:numId="1009">
     <w:abstractNumId w:val="991"/>
   </w:num>
 </w:numbering>

</xml_diff>